<commit_message>
Level 10 Matematika & Bahasa Indonesia: campuran soal level 8 dan 9
Level 10 terlalu sulit untuk anak SD; cetakan lama tetap di berkas soal tetapi tidak dipakai.
Keterangan di Materi & Level Soal, panduan, dan README disesuaikan; versi cache dinaikkan.

Co-Authored-By: Claude Opus 5.5 <noreply@anthropic.com>
</commit_message>
<xml_diff>
--- a/Panduan_Petualangan_TKA_SD.docx
+++ b/Panduan_Petualangan_TKA_SD.docx
@@ -220,7 +220,7 @@
           <w:sz w:val="19"/>
           <w:szCs w:val="19"/>
         </w:rPr>
-        <w:t xml:space="preserve">Versi: 15 Oktober 2026 (sesuai tampilan aplikasi per tanggal tersebut)</w:t>
+        <w:t xml:space="preserve">Versi: 17 Oktober 2026 (sesuai tampilan aplikasi per tanggal tersebut)</w:t>
       </w:r>
     </w:p>
     <w:p>
@@ -2442,7 +2442,39 @@
                 <w:sz w:val="19"/>
                 <w:szCs w:val="19"/>
               </w:rPr>
-              <w:t xml:space="preserve"> dan mendapat piala misi.</w:t>
+              <w:t xml:space="preserve"> dan mendapat piala misi. Di </w:t>
+            </w:r>
+            <w:r>
+              <w:rPr>
+                <w:b/>
+                <w:bCs/>
+                <w:sz w:val="19"/>
+                <w:szCs w:val="19"/>
+              </w:rPr>
+              <w:t xml:space="preserve">Matematika</w:t>
+            </w:r>
+            <w:r>
+              <w:rPr>
+                <w:sz w:val="19"/>
+                <w:szCs w:val="19"/>
+              </w:rPr>
+              <w:t xml:space="preserve"> dan </w:t>
+            </w:r>
+            <w:r>
+              <w:rPr>
+                <w:b/>
+                <w:bCs/>
+                <w:sz w:val="19"/>
+                <w:szCs w:val="19"/>
+              </w:rPr>
+              <w:t xml:space="preserve">Bahasa Indonesia</w:t>
+            </w:r>
+            <w:r>
+              <w:rPr>
+                <w:sz w:val="19"/>
+                <w:szCs w:val="19"/>
+              </w:rPr>
+              <w:t xml:space="preserve">, soal Level 10 adalah campuran soal Level 8 dan 9 (tidak lebih sulit dari Level 9).</w:t>
             </w:r>
           </w:p>
         </w:tc>

</xml_diff>

<commit_message>
Dasbor Ortu: kartu "Di mana anak kesulitan" — titik lemah per level, Pos Tes per pos, soal yang salah
- Misi & level tersulit dari riwayat level (akurasi < 70% atau 2× belum lulus)
- Persen benar per pos/jurus dari 3 hasil terakhir tiap Pos Tes & Simulasi TKA
- Soal yang terakhir salah (jawaban anak, kunci, pembahasan) disimpan & disinkronkan, dibatasi ukurannya
- Panduan PDF & Word diperbarui

Co-Authored-By: Claude Opus 5.5 <noreply@anthropic.com>
</commit_message>
<xml_diff>
--- a/Panduan_Petualangan_TKA_SD.docx
+++ b/Panduan_Petualangan_TKA_SD.docx
@@ -220,7 +220,7 @@
           <w:sz w:val="19"/>
           <w:szCs w:val="19"/>
         </w:rPr>
-        <w:t xml:space="preserve">Versi: 17 Oktober 2026 (sesuai tampilan aplikasi per tanggal tersebut)</w:t>
+        <w:t xml:space="preserve">Versi: 18 Oktober 2026 (sesuai tampilan aplikasi per tanggal tersebut)</w:t>
       </w:r>
     </w:p>
     <w:p>
@@ -620,7 +620,7 @@
           <w:bCs w:val="false"/>
           <w:color w:val="33445A"/>
         </w:rPr>
-        <w:t xml:space="preserve">5.2 Target vs kemajuan nyata</w:t>
+        <w:t xml:space="preserve">5.2 Di mana anak kesulitan</w:t>
       </w:r>
     </w:p>
     <w:p>
@@ -634,7 +634,7 @@
           <w:bCs w:val="false"/>
           <w:color w:val="33445A"/>
         </w:rPr>
-        <w:t xml:space="preserve">5.3 Pos Tes</w:t>
+        <w:t xml:space="preserve">5.3 Target vs kemajuan nyata</w:t>
       </w:r>
     </w:p>
     <w:p>
@@ -648,7 +648,7 @@
           <w:bCs w:val="false"/>
           <w:color w:val="33445A"/>
         </w:rPr>
-        <w:t xml:space="preserve">5.4 Simulasi TKA</w:t>
+        <w:t xml:space="preserve">5.4 Pos Tes</w:t>
       </w:r>
     </w:p>
     <w:p>
@@ -662,7 +662,7 @@
           <w:bCs w:val="false"/>
           <w:color w:val="33445A"/>
         </w:rPr>
-        <w:t xml:space="preserve">5.5 Aktivitas terakhir</w:t>
+        <w:t xml:space="preserve">5.5 Simulasi TKA</w:t>
       </w:r>
     </w:p>
     <w:p>
@@ -676,7 +676,21 @@
           <w:bCs w:val="false"/>
           <w:color w:val="33445A"/>
         </w:rPr>
-        <w:t xml:space="preserve">5.6 Kemajuan per misi</w:t>
+        <w:t xml:space="preserve">5.6 Aktivitas terakhir</w:t>
+      </w:r>
+    </w:p>
+    <w:p>
+      <w:pPr>
+        <w:spacing w:after="50" w:before="0"/>
+        <w:ind w:left="360"/>
+      </w:pPr>
+      <w:r>
+        <w:rPr>
+          <w:b w:val="false"/>
+          <w:bCs w:val="false"/>
+          <w:color w:val="33445A"/>
+        </w:rPr>
+        <w:t xml:space="preserve">5.7 Kemajuan per misi</w:t>
       </w:r>
     </w:p>
     <w:p>
@@ -9528,6 +9542,19 @@
         <w:spacing w:after="60"/>
       </w:pPr>
       <w:r>
+        <w:t xml:space="preserve">🔍 Di mana anak kesulitan</w:t>
+      </w:r>
+    </w:p>
+    <w:p>
+      <w:pPr>
+        <w:pStyle w:val="ListParagraph"/>
+        <w:numPr>
+          <w:ilvl w:val="0"/>
+          <w:numId w:val="5"/>
+        </w:numPr>
+        <w:spacing w:after="60"/>
+      </w:pPr>
+      <w:r>
         <w:t xml:space="preserve">Target vs kemajuan nyata (dengan Catatan 14 hari terakhir)</w:t>
       </w:r>
     </w:p>
@@ -10346,7 +10373,573 @@
         <w:pStyle w:val="Heading2"/>
       </w:pPr>
       <w:r>
-        <w:t xml:space="preserve">5.2 Target vs kemajuan nyata</w:t>
+        <w:t xml:space="preserve">5.2 Di mana anak kesulitan</w:t>
+      </w:r>
+    </w:p>
+    <w:p>
+      <w:pPr>
+        <w:spacing w:after="120"/>
+      </w:pPr>
+      <w:r>
+        <w:t xml:space="preserve">Kartu </w:t>
+      </w:r>
+      <w:r>
+        <w:rPr>
+          <w:b/>
+          <w:bCs/>
+        </w:rPr>
+        <w:t xml:space="preserve">🔍 Di mana anak kesulitan</w:t>
+      </w:r>
+      <w:r>
+        <w:t xml:space="preserve"> menjawab: </w:t>
+      </w:r>
+      <w:r>
+        <w:rPr>
+          <w:b/>
+          <w:bCs/>
+        </w:rPr>
+        <w:t xml:space="preserve">"Materi mana yang membuat anak tersendat, dan salahnya seperti apa?"</w:t>
+      </w:r>
+      <w:r>
+        <w:t xml:space="preserve"> Isinya tiga bagian:</w:t>
+      </w:r>
+    </w:p>
+    <w:tbl>
+      <w:tblPr>
+        <w:tblW w:type="dxa" w:w="9638"/>
+        <w:tblBorders>
+          <w:top w:val="single" w:color="D5DCE6" w:sz="4"/>
+          <w:left w:val="none" w:color="FFFFFF" w:sz="0"/>
+          <w:bottom w:val="single" w:color="D5DCE6" w:sz="4"/>
+          <w:right w:val="none" w:color="FFFFFF" w:sz="0"/>
+          <w:insideH w:val="single" w:color="D5DCE6" w:sz="4"/>
+          <w:insideV w:val="none" w:color="FFFFFF" w:sz="0"/>
+        </w:tblBorders>
+      </w:tblPr>
+      <w:tblGrid>
+        <w:gridCol w:w="2551"/>
+        <w:gridCol w:w="3969"/>
+        <w:gridCol w:w="3118"/>
+      </w:tblGrid>
+      <w:tr>
+        <w:trPr>
+          <w:cantSplit/>
+          <w:tblHeader/>
+        </w:trPr>
+        <w:tc>
+          <w:tcPr>
+            <w:tcW w:type="dxa" w:w="2551"/>
+            <w:shd w:fill="1D2A3A" w:color="auto" w:val="clear"/>
+            <w:tcMar>
+              <w:top w:type="dxa" w:w="70"/>
+              <w:left w:type="dxa" w:w="110"/>
+              <w:bottom w:type="dxa" w:w="70"/>
+              <w:right w:type="dxa" w:w="110"/>
+            </w:tcMar>
+          </w:tcPr>
+          <w:p>
+            <w:pPr>
+              <w:spacing w:after="0"/>
+            </w:pPr>
+            <w:r>
+              <w:rPr>
+                <w:b/>
+                <w:bCs/>
+                <w:color w:val="FFFFFF"/>
+                <w:sz w:val="19"/>
+                <w:szCs w:val="19"/>
+              </w:rPr>
+              <w:t xml:space="preserve">Bagian</w:t>
+            </w:r>
+          </w:p>
+        </w:tc>
+        <w:tc>
+          <w:tcPr>
+            <w:tcW w:type="dxa" w:w="3969"/>
+            <w:shd w:fill="1D2A3A" w:color="auto" w:val="clear"/>
+            <w:tcMar>
+              <w:top w:type="dxa" w:w="70"/>
+              <w:left w:type="dxa" w:w="110"/>
+              <w:bottom w:type="dxa" w:w="70"/>
+              <w:right w:type="dxa" w:w="110"/>
+            </w:tcMar>
+          </w:tcPr>
+          <w:p>
+            <w:pPr>
+              <w:spacing w:after="0"/>
+            </w:pPr>
+            <w:r>
+              <w:rPr>
+                <w:b/>
+                <w:bCs/>
+                <w:color w:val="FFFFFF"/>
+                <w:sz w:val="19"/>
+                <w:szCs w:val="19"/>
+              </w:rPr>
+              <w:t xml:space="preserve">Arti</w:t>
+            </w:r>
+          </w:p>
+        </w:tc>
+        <w:tc>
+          <w:tcPr>
+            <w:tcW w:type="dxa" w:w="3118"/>
+            <w:shd w:fill="1D2A3A" w:color="auto" w:val="clear"/>
+            <w:tcMar>
+              <w:top w:type="dxa" w:w="70"/>
+              <w:left w:type="dxa" w:w="110"/>
+              <w:bottom w:type="dxa" w:w="70"/>
+              <w:right w:type="dxa" w:w="110"/>
+            </w:tcMar>
+          </w:tcPr>
+          <w:p>
+            <w:pPr>
+              <w:spacing w:after="0"/>
+            </w:pPr>
+            <w:r>
+              <w:rPr>
+                <w:b/>
+                <w:bCs/>
+                <w:color w:val="FFFFFF"/>
+                <w:sz w:val="19"/>
+                <w:szCs w:val="19"/>
+              </w:rPr>
+              <w:t xml:space="preserve">Cara membaca</w:t>
+            </w:r>
+          </w:p>
+        </w:tc>
+      </w:tr>
+      <w:tr>
+        <w:trPr>
+          <w:cantSplit/>
+        </w:trPr>
+        <w:tc>
+          <w:tcPr>
+            <w:tcW w:type="dxa" w:w="2551"/>
+            <w:tcMar>
+              <w:top w:type="dxa" w:w="70"/>
+              <w:left w:type="dxa" w:w="110"/>
+              <w:bottom w:type="dxa" w:w="70"/>
+              <w:right w:type="dxa" w:w="110"/>
+            </w:tcMar>
+          </w:tcPr>
+          <w:p>
+            <w:pPr>
+              <w:spacing w:after="0"/>
+            </w:pPr>
+            <w:r>
+              <w:rPr>
+                <w:b/>
+                <w:bCs/>
+                <w:sz w:val="19"/>
+                <w:szCs w:val="19"/>
+              </w:rPr>
+              <w:t xml:space="preserve">Misi &amp; level yang paling sulit</w:t>
+            </w:r>
+          </w:p>
+        </w:tc>
+        <w:tc>
+          <w:tcPr>
+            <w:tcW w:type="dxa" w:w="3969"/>
+            <w:tcMar>
+              <w:top w:type="dxa" w:w="70"/>
+              <w:left w:type="dxa" w:w="110"/>
+              <w:bottom w:type="dxa" w:w="70"/>
+              <w:right w:type="dxa" w:w="110"/>
+            </w:tcMar>
+          </w:tcPr>
+          <w:p>
+            <w:pPr>
+              <w:spacing w:after="0"/>
+            </w:pPr>
+            <w:r>
+              <w:rPr>
+                <w:sz w:val="19"/>
+                <w:szCs w:val="19"/>
+              </w:rPr>
+              <w:t xml:space="preserve">Paling banyak 6 pasangan misi + level dengan akurasi di bawah 70% (minimal 5 jawaban) atau yang </w:t>
+            </w:r>
+            <w:r>
+              <w:rPr>
+                <w:b/>
+                <w:bCs/>
+                <w:sz w:val="19"/>
+                <w:szCs w:val="19"/>
+              </w:rPr>
+              <w:t xml:space="preserve">2× atau lebih belum lulus</w:t>
+            </w:r>
+            <w:r>
+              <w:rPr>
+                <w:sz w:val="19"/>
+                <w:szCs w:val="19"/>
+              </w:rPr>
+              <w:t xml:space="preserve">, diurutkan dari yang paling sulit. Batang hijau ≥ 75%, kuning 60–74%, merah &lt; 60%.</w:t>
+            </w:r>
+          </w:p>
+        </w:tc>
+        <w:tc>
+          <w:tcPr>
+            <w:tcW w:type="dxa" w:w="3118"/>
+            <w:tcMar>
+              <w:top w:type="dxa" w:w="70"/>
+              <w:left w:type="dxa" w:w="110"/>
+              <w:bottom w:type="dxa" w:w="70"/>
+              <w:right w:type="dxa" w:w="110"/>
+            </w:tcMar>
+          </w:tcPr>
+          <w:p>
+            <w:pPr>
+              <w:spacing w:after="0"/>
+            </w:pPr>
+            <w:r>
+              <w:rPr>
+                <w:sz w:val="19"/>
+                <w:szCs w:val="19"/>
+              </w:rPr>
+              <w:t xml:space="preserve">Label </w:t>
+            </w:r>
+            <w:r>
+              <w:rPr>
+                <w:b/>
+                <w:bCs/>
+                <w:sz w:val="19"/>
+                <w:szCs w:val="19"/>
+              </w:rPr>
+              <w:t xml:space="preserve">masih tersangkut</w:t>
+            </w:r>
+            <w:r>
+              <w:rPr>
+                <w:sz w:val="19"/>
+                <w:szCs w:val="19"/>
+              </w:rPr>
+              <w:t xml:space="preserve"> = level itu belum lulus sampai sekarang; </w:t>
+            </w:r>
+            <w:r>
+              <w:rPr>
+                <w:b/>
+                <w:bCs/>
+                <w:sz w:val="19"/>
+                <w:szCs w:val="19"/>
+              </w:rPr>
+              <w:t xml:space="preserve">sudah lulus</w:t>
+            </w:r>
+            <w:r>
+              <w:rPr>
+                <w:sz w:val="19"/>
+                <w:szCs w:val="19"/>
+              </w:rPr>
+              <w:t xml:space="preserve"> = sempat gagal, tetapi akhirnya lulus.</w:t>
+            </w:r>
+          </w:p>
+        </w:tc>
+      </w:tr>
+      <w:tr>
+        <w:trPr>
+          <w:cantSplit/>
+        </w:trPr>
+        <w:tc>
+          <w:tcPr>
+            <w:tcW w:type="dxa" w:w="2551"/>
+            <w:shd w:fill="F6F8FB" w:color="auto" w:val="clear"/>
+            <w:tcMar>
+              <w:top w:type="dxa" w:w="70"/>
+              <w:left w:type="dxa" w:w="110"/>
+              <w:bottom w:type="dxa" w:w="70"/>
+              <w:right w:type="dxa" w:w="110"/>
+            </w:tcMar>
+          </w:tcPr>
+          <w:p>
+            <w:pPr>
+              <w:spacing w:after="0"/>
+            </w:pPr>
+            <w:r>
+              <w:rPr>
+                <w:b/>
+                <w:bCs/>
+                <w:sz w:val="19"/>
+                <w:szCs w:val="19"/>
+              </w:rPr>
+              <w:t xml:space="preserve">Pos/jurus di Pos Tes &amp; Simulasi TKA</w:t>
+            </w:r>
+          </w:p>
+        </w:tc>
+        <w:tc>
+          <w:tcPr>
+            <w:tcW w:type="dxa" w:w="3969"/>
+            <w:shd w:fill="F6F8FB" w:color="auto" w:val="clear"/>
+            <w:tcMar>
+              <w:top w:type="dxa" w:w="70"/>
+              <w:left w:type="dxa" w:w="110"/>
+              <w:bottom w:type="dxa" w:w="70"/>
+              <w:right w:type="dxa" w:w="110"/>
+            </w:tcMar>
+          </w:tcPr>
+          <w:p>
+            <w:pPr>
+              <w:spacing w:after="0"/>
+            </w:pPr>
+            <w:r>
+              <w:rPr>
+                <w:sz w:val="19"/>
+                <w:szCs w:val="19"/>
+              </w:rPr>
+              <w:t xml:space="preserve">Persen benar per pos/jurus dari 3 hasil terakhir setiap tes, dari yang terlemah. Label </w:t>
+            </w:r>
+            <w:r>
+              <w:rPr>
+                <w:b/>
+                <w:bCs/>
+                <w:sz w:val="19"/>
+                <w:szCs w:val="19"/>
+              </w:rPr>
+              <w:t xml:space="preserve">perlu diperkuat</w:t>
+            </w:r>
+            <w:r>
+              <w:rPr>
+                <w:sz w:val="19"/>
+                <w:szCs w:val="19"/>
+              </w:rPr>
+              <w:t xml:space="preserve"> bila di bawah 60%.</w:t>
+            </w:r>
+          </w:p>
+        </w:tc>
+        <w:tc>
+          <w:tcPr>
+            <w:tcW w:type="dxa" w:w="3118"/>
+            <w:shd w:fill="F6F8FB" w:color="auto" w:val="clear"/>
+            <w:tcMar>
+              <w:top w:type="dxa" w:w="70"/>
+              <w:left w:type="dxa" w:w="110"/>
+              <w:bottom w:type="dxa" w:w="70"/>
+              <w:right w:type="dxa" w:w="110"/>
+            </w:tcMar>
+          </w:tcPr>
+          <w:p>
+            <w:pPr>
+              <w:spacing w:after="0"/>
+            </w:pPr>
+            <w:r>
+              <w:rPr>
+                <w:sz w:val="19"/>
+                <w:szCs w:val="19"/>
+              </w:rPr>
+              <w:t xml:space="preserve">Pos/jurus paling atas adalah materi yang paling perlu diulang sebelum TKA.</w:t>
+            </w:r>
+          </w:p>
+        </w:tc>
+      </w:tr>
+      <w:tr>
+        <w:trPr>
+          <w:cantSplit/>
+        </w:trPr>
+        <w:tc>
+          <w:tcPr>
+            <w:tcW w:type="dxa" w:w="2551"/>
+            <w:tcMar>
+              <w:top w:type="dxa" w:w="70"/>
+              <w:left w:type="dxa" w:w="110"/>
+              <w:bottom w:type="dxa" w:w="70"/>
+              <w:right w:type="dxa" w:w="110"/>
+            </w:tcMar>
+          </w:tcPr>
+          <w:p>
+            <w:pPr>
+              <w:spacing w:after="0"/>
+            </w:pPr>
+            <w:r>
+              <w:rPr>
+                <w:b/>
+                <w:bCs/>
+                <w:sz w:val="19"/>
+                <w:szCs w:val="19"/>
+              </w:rPr>
+              <w:t xml:space="preserve">❌ Soal yang terakhir dijawab salah</w:t>
+            </w:r>
+          </w:p>
+        </w:tc>
+        <w:tc>
+          <w:tcPr>
+            <w:tcW w:type="dxa" w:w="3969"/>
+            <w:tcMar>
+              <w:top w:type="dxa" w:w="70"/>
+              <w:left w:type="dxa" w:w="110"/>
+              <w:bottom w:type="dxa" w:w="70"/>
+              <w:right w:type="dxa" w:w="110"/>
+            </w:tcMar>
+          </w:tcPr>
+          <w:p>
+            <w:pPr>
+              <w:spacing w:after="0"/>
+            </w:pPr>
+            <w:r>
+              <w:rPr>
+                <w:sz w:val="19"/>
+                <w:szCs w:val="19"/>
+              </w:rPr>
+              <w:t xml:space="preserve">10 soal salah terbaru: soal, </w:t>
+            </w:r>
+            <w:r>
+              <w:rPr>
+                <w:b/>
+                <w:bCs/>
+                <w:sz w:val="19"/>
+                <w:szCs w:val="19"/>
+              </w:rPr>
+              <w:t xml:space="preserve">jawaban anak</w:t>
+            </w:r>
+            <w:r>
+              <w:rPr>
+                <w:sz w:val="19"/>
+                <w:szCs w:val="19"/>
+              </w:rPr>
+              <w:t xml:space="preserve">, kunci, dan pembahasan.</w:t>
+            </w:r>
+          </w:p>
+        </w:tc>
+        <w:tc>
+          <w:tcPr>
+            <w:tcW w:type="dxa" w:w="3118"/>
+            <w:tcMar>
+              <w:top w:type="dxa" w:w="70"/>
+              <w:left w:type="dxa" w:w="110"/>
+              <w:bottom w:type="dxa" w:w="70"/>
+              <w:right w:type="dxa" w:w="110"/>
+            </w:tcMar>
+          </w:tcPr>
+          <w:p>
+            <w:pPr>
+              <w:spacing w:after="0"/>
+            </w:pPr>
+            <w:r>
+              <w:rPr>
+                <w:sz w:val="19"/>
+                <w:szCs w:val="19"/>
+              </w:rPr>
+              <w:t xml:space="preserve">Bandingkan jawaban anak dengan kunci untuk melihat pola salahnya, mis. selalu lupa menyederhanakan pecahan.</w:t>
+            </w:r>
+          </w:p>
+        </w:tc>
+      </w:tr>
+    </w:tbl>
+    <w:p>
+      <w:pPr>
+        <w:spacing w:after="120"/>
+      </w:pPr>
+    </w:p>
+    <w:p>
+      <w:pPr>
+        <w:spacing w:after="120"/>
+      </w:pPr>
+      <w:r>
+        <w:t xml:space="preserve">Ketuk satu baris misi untuk membuka soal-soal yang salah di misi itu (level yang sama ditampilkan lebih dulu). Tombol </w:t>
+      </w:r>
+      <w:r>
+        <w:rPr>
+          <w:b/>
+          <w:bCs/>
+        </w:rPr>
+        <w:t xml:space="preserve">📚 Lihat contoh soal &amp; coba level ini</w:t>
+      </w:r>
+      <w:r>
+        <w:t xml:space="preserve"> membuka misi itu di tab </w:t>
+      </w:r>
+      <w:r>
+        <w:rPr>
+          <w:b/>
+          <w:bCs/>
+        </w:rPr>
+        <w:t xml:space="preserve">Materi &amp; Level Soal</w:t>
+      </w:r>
+      <w:r>
+        <w:t xml:space="preserve">.</w:t>
+      </w:r>
+    </w:p>
+    <w:tbl>
+      <w:tblPr>
+        <w:tblW w:type="dxa" w:w="9638"/>
+        <w:tblBorders>
+          <w:top w:val="none" w:color="FFFFFF" w:sz="0"/>
+          <w:left w:val="single" w:color="2F7FD8" w:sz="30"/>
+          <w:bottom w:val="none" w:color="FFFFFF" w:sz="0"/>
+          <w:right w:val="none" w:color="FFFFFF" w:sz="0"/>
+          <w:insideH w:val="none" w:color="FFFFFF" w:sz="0"/>
+          <w:insideV w:val="none" w:color="FFFFFF" w:sz="0"/>
+        </w:tblBorders>
+      </w:tblPr>
+      <w:tblGrid>
+        <w:gridCol w:w="9638"/>
+      </w:tblGrid>
+      <w:tr>
+        <w:trPr>
+          <w:cantSplit/>
+        </w:trPr>
+        <w:tc>
+          <w:tcPr>
+            <w:tcW w:type="dxa" w:w="9638"/>
+            <w:shd w:fill="E8F1FC" w:color="auto" w:val="clear"/>
+            <w:tcMar>
+              <w:top w:type="dxa" w:w="120"/>
+              <w:left w:type="dxa" w:w="200"/>
+              <w:bottom w:type="dxa" w:w="120"/>
+              <w:right w:type="dxa" w:w="160"/>
+            </w:tcMar>
+          </w:tcPr>
+          <w:p>
+            <w:pPr>
+              <w:spacing w:after="40"/>
+            </w:pPr>
+            <w:r>
+              <w:rPr>
+                <w:b/>
+                <w:bCs/>
+                <w:color w:val="2F7FD8"/>
+                <w:sz w:val="20"/>
+                <w:szCs w:val="20"/>
+              </w:rPr>
+              <w:t xml:space="preserve">Catatan data</w:t>
+            </w:r>
+          </w:p>
+          <w:p>
+            <w:pPr>
+              <w:spacing w:after="40"/>
+            </w:pPr>
+            <w:r>
+              <w:rPr>
+                <w:sz w:val="19"/>
+                <w:szCs w:val="19"/>
+              </w:rPr>
+              <w:t xml:space="preserve">Akurasi per level dihitung dari riwayat level, jadi latihan sebelum fitur ini ikut terhitung. Contoh soal yang salah baru dicatat sejak </w:t>
+            </w:r>
+            <w:r>
+              <w:rPr>
+                <w:b/>
+                <w:bCs/>
+                <w:sz w:val="19"/>
+                <w:szCs w:val="19"/>
+              </w:rPr>
+              <w:t xml:space="preserve">18 Oktober 2026</w:t>
+            </w:r>
+            <w:r>
+              <w:rPr>
+                <w:sz w:val="19"/>
+                <w:szCs w:val="19"/>
+              </w:rPr>
+              <w:t xml:space="preserve">: paling banyak 3 soal terbaru per misi dan 30 soal seluruhnya (Pos Tes paling banyak 6 soal per tes). Soal salah dari HP anak ikut tersimpan online, jadi terlihat juga di HP orang tua.</w:t>
+            </w:r>
+          </w:p>
+        </w:tc>
+      </w:tr>
+    </w:tbl>
+    <w:p>
+      <w:pPr>
+        <w:spacing w:after="120"/>
+      </w:pPr>
+    </w:p>
+    <w:p>
+      <w:pPr>
+        <w:pStyle w:val="Heading2"/>
+      </w:pPr>
+      <w:r>
+        <w:t xml:space="preserve">5.3 Target vs kemajuan nyata</w:t>
       </w:r>
     </w:p>
     <w:p>
@@ -11103,7 +11696,7 @@
         <w:pStyle w:val="Heading3"/>
       </w:pPr>
       <w:r>
-        <w:t xml:space="preserve">5.2.1 Catatan 14 hari terakhir</w:t>
+        <w:t xml:space="preserve">5.3.1 Catatan 14 hari terakhir</w:t>
       </w:r>
     </w:p>
     <w:p>
@@ -11914,7 +12507,7 @@
         <w:pStyle w:val="Heading2"/>
       </w:pPr>
       <w:r>
-        <w:t xml:space="preserve">5.3 Pos Tes</w:t>
+        <w:t xml:space="preserve">5.4 Pos Tes</w:t>
       </w:r>
     </w:p>
     <w:tbl>
@@ -12220,7 +12813,7 @@
         <w:pStyle w:val="Heading2"/>
       </w:pPr>
       <w:r>
-        <w:t xml:space="preserve">5.4 Simulasi TKA</w:t>
+        <w:t xml:space="preserve">5.5 Simulasi TKA</w:t>
       </w:r>
     </w:p>
     <w:p>
@@ -12246,7 +12839,7 @@
         <w:pStyle w:val="Heading2"/>
       </w:pPr>
       <w:r>
-        <w:t xml:space="preserve">5.5 Aktivitas terakhir</w:t>
+        <w:t xml:space="preserve">5.6 Aktivitas terakhir</w:t>
       </w:r>
     </w:p>
     <w:p>
@@ -12282,7 +12875,7 @@
         <w:pStyle w:val="Heading2"/>
       </w:pPr>
       <w:r>
-        <w:t xml:space="preserve">5.6 Kemajuan per misi</w:t>
+        <w:t xml:space="preserve">5.7 Kemajuan per misi</w:t>
       </w:r>
     </w:p>
     <w:p>
@@ -15404,7 +15997,7 @@
                 <w:sz w:val="19"/>
                 <w:szCs w:val="19"/>
               </w:rPr>
-              <w:t xml:space="preserve">Dasbor → Perlu latihan tambahan; Kemajuan per misi kolom Hasil</w:t>
+              <w:t xml:space="preserve">Dasbor → 🔍 Di mana anak kesulitan; Kemajuan per misi kolom Hasil</w:t>
             </w:r>
           </w:p>
         </w:tc>
@@ -15427,7 +16020,7 @@
                 <w:sz w:val="19"/>
                 <w:szCs w:val="19"/>
               </w:rPr>
-              <w:t xml:space="preserve">Lihat Contoh di Materi &amp; Level Soal; ajak anak membaca 📖 Pelajari dulu; ulangi level berbintang sedikit.</w:t>
+              <w:t xml:space="preserve">Buka baris misinya untuk melihat soal yang salah dan jawaban anak; lihat Contoh di Materi &amp; Level Soal; ajak anak membaca 📖 Pelajari dulu; ulangi level berbintang sedikit.</w:t>
             </w:r>
           </w:p>
         </w:tc>
@@ -15480,7 +16073,7 @@
                 <w:sz w:val="19"/>
                 <w:szCs w:val="19"/>
               </w:rPr>
-              <w:t xml:space="preserve">Aktivitas terakhir: level sama berulang "belum lulus"</w:t>
+              <w:t xml:space="preserve">🔍 Di mana anak kesulitan: label masih tersangkut; Aktivitas terakhir: level sama berulang "belum lulus"</w:t>
             </w:r>
           </w:p>
         </w:tc>
@@ -15631,7 +16224,7 @@
                 <w:sz w:val="19"/>
                 <w:szCs w:val="19"/>
               </w:rPr>
-              <w:t xml:space="preserve">Dasbor → Pos Tes; layar hasil tabel per materi</w:t>
+              <w:t xml:space="preserve">Dasbor → Pos Tes; 🔍 Di mana anak kesulitan → Pos/jurus</w:t>
             </w:r>
           </w:p>
         </w:tc>

</xml_diff>

<commit_message>
Dasbor Ortu: Laporan untuk keluarga — ringkasan & saran siap dikirim via WhatsApp
- Kesimpulan, gambaran keseluruhan per mapel, minggu ini, menuju TKA, sudah dikuasai, perlu bantuan, saran
- Disusun dari data anak dengan aturan sederhana; teks bisa diubah sebelum dikirim
- Kirim via wa.me, menu Bagikan, atau salin; Kode Anak tidak ikut dikirim
- Panduan PDF & Word diperbarui

Co-Authored-By: Claude Opus 5.5 <noreply@anthropic.com>
</commit_message>
<xml_diff>
--- a/Panduan_Petualangan_TKA_SD.docx
+++ b/Panduan_Petualangan_TKA_SD.docx
@@ -620,7 +620,7 @@
           <w:bCs w:val="false"/>
           <w:color w:val="33445A"/>
         </w:rPr>
-        <w:t xml:space="preserve">5.2 Di mana anak kesulitan</w:t>
+        <w:t xml:space="preserve">5.2 Laporan untuk keluarga</w:t>
       </w:r>
     </w:p>
     <w:p>
@@ -634,7 +634,7 @@
           <w:bCs w:val="false"/>
           <w:color w:val="33445A"/>
         </w:rPr>
-        <w:t xml:space="preserve">5.3 Target vs kemajuan nyata</w:t>
+        <w:t xml:space="preserve">5.3 Di mana anak kesulitan</w:t>
       </w:r>
     </w:p>
     <w:p>
@@ -648,7 +648,7 @@
           <w:bCs w:val="false"/>
           <w:color w:val="33445A"/>
         </w:rPr>
-        <w:t xml:space="preserve">5.4 Pos Tes</w:t>
+        <w:t xml:space="preserve">5.4 Target vs kemajuan nyata</w:t>
       </w:r>
     </w:p>
     <w:p>
@@ -662,7 +662,7 @@
           <w:bCs w:val="false"/>
           <w:color w:val="33445A"/>
         </w:rPr>
-        <w:t xml:space="preserve">5.5 Simulasi TKA</w:t>
+        <w:t xml:space="preserve">5.5 Pos Tes</w:t>
       </w:r>
     </w:p>
     <w:p>
@@ -676,7 +676,7 @@
           <w:bCs w:val="false"/>
           <w:color w:val="33445A"/>
         </w:rPr>
-        <w:t xml:space="preserve">5.6 Aktivitas terakhir</w:t>
+        <w:t xml:space="preserve">5.6 Simulasi TKA</w:t>
       </w:r>
     </w:p>
     <w:p>
@@ -690,7 +690,21 @@
           <w:bCs w:val="false"/>
           <w:color w:val="33445A"/>
         </w:rPr>
-        <w:t xml:space="preserve">5.7 Kemajuan per misi</w:t>
+        <w:t xml:space="preserve">5.7 Aktivitas terakhir</w:t>
+      </w:r>
+    </w:p>
+    <w:p>
+      <w:pPr>
+        <w:spacing w:after="50" w:before="0"/>
+        <w:ind w:left="360"/>
+      </w:pPr>
+      <w:r>
+        <w:rPr>
+          <w:b w:val="false"/>
+          <w:bCs w:val="false"/>
+          <w:color w:val="33445A"/>
+        </w:rPr>
+        <w:t xml:space="preserve">5.8 Kemajuan per misi</w:t>
       </w:r>
     </w:p>
     <w:p>
@@ -9542,6 +9556,19 @@
         <w:spacing w:after="60"/>
       </w:pPr>
       <w:r>
+        <w:t xml:space="preserve">📲 Laporan untuk keluarga</w:t>
+      </w:r>
+    </w:p>
+    <w:p>
+      <w:pPr>
+        <w:pStyle w:val="ListParagraph"/>
+        <w:numPr>
+          <w:ilvl w:val="0"/>
+          <w:numId w:val="5"/>
+        </w:numPr>
+        <w:spacing w:after="60"/>
+      </w:pPr>
+      <w:r>
         <w:t xml:space="preserve">🔍 Di mana anak kesulitan</w:t>
       </w:r>
     </w:p>
@@ -10373,7 +10400,631 @@
         <w:pStyle w:val="Heading2"/>
       </w:pPr>
       <w:r>
-        <w:t xml:space="preserve">5.2 Di mana anak kesulitan</w:t>
+        <w:t xml:space="preserve">5.2 Laporan untuk keluarga</w:t>
+      </w:r>
+    </w:p>
+    <w:p>
+      <w:pPr>
+        <w:spacing w:after="120"/>
+      </w:pPr>
+      <w:r>
+        <w:t xml:space="preserve">Kartu </w:t>
+      </w:r>
+      <w:r>
+        <w:rPr>
+          <w:b/>
+          <w:bCs/>
+        </w:rPr>
+        <w:t xml:space="preserve">📲 Laporan untuk keluarga</w:t>
+      </w:r>
+      <w:r>
+        <w:t xml:space="preserve"> menyusun pesan WhatsApp berisi ringkasan dan saran, siap dikirim ke grup keluarga (misalnya untuk ibu atau kakak). Isinya disusun aplikasi dari data anak:</w:t>
+      </w:r>
+    </w:p>
+    <w:tbl>
+      <w:tblPr>
+        <w:tblW w:type="dxa" w:w="9638"/>
+        <w:tblBorders>
+          <w:top w:val="single" w:color="D5DCE6" w:sz="4"/>
+          <w:left w:val="none" w:color="FFFFFF" w:sz="0"/>
+          <w:bottom w:val="single" w:color="D5DCE6" w:sz="4"/>
+          <w:right w:val="none" w:color="FFFFFF" w:sz="0"/>
+          <w:insideH w:val="single" w:color="D5DCE6" w:sz="4"/>
+          <w:insideV w:val="none" w:color="FFFFFF" w:sz="0"/>
+        </w:tblBorders>
+      </w:tblPr>
+      <w:tblGrid>
+        <w:gridCol w:w="2711"/>
+        <w:gridCol w:w="6927"/>
+      </w:tblGrid>
+      <w:tr>
+        <w:trPr>
+          <w:cantSplit/>
+          <w:tblHeader/>
+        </w:trPr>
+        <w:tc>
+          <w:tcPr>
+            <w:tcW w:type="dxa" w:w="2711"/>
+            <w:shd w:fill="1D2A3A" w:color="auto" w:val="clear"/>
+            <w:tcMar>
+              <w:top w:type="dxa" w:w="70"/>
+              <w:left w:type="dxa" w:w="110"/>
+              <w:bottom w:type="dxa" w:w="70"/>
+              <w:right w:type="dxa" w:w="110"/>
+            </w:tcMar>
+          </w:tcPr>
+          <w:p>
+            <w:pPr>
+              <w:spacing w:after="0"/>
+            </w:pPr>
+            <w:r>
+              <w:rPr>
+                <w:b/>
+                <w:bCs/>
+                <w:color w:val="FFFFFF"/>
+                <w:sz w:val="19"/>
+                <w:szCs w:val="19"/>
+              </w:rPr>
+              <w:t xml:space="preserve">Bagian pesan</w:t>
+            </w:r>
+          </w:p>
+        </w:tc>
+        <w:tc>
+          <w:tcPr>
+            <w:tcW w:type="dxa" w:w="6927"/>
+            <w:shd w:fill="1D2A3A" w:color="auto" w:val="clear"/>
+            <w:tcMar>
+              <w:top w:type="dxa" w:w="70"/>
+              <w:left w:type="dxa" w:w="110"/>
+              <w:bottom w:type="dxa" w:w="70"/>
+              <w:right w:type="dxa" w:w="110"/>
+            </w:tcMar>
+          </w:tcPr>
+          <w:p>
+            <w:pPr>
+              <w:spacing w:after="0"/>
+            </w:pPr>
+            <w:r>
+              <w:rPr>
+                <w:b/>
+                <w:bCs/>
+                <w:color w:val="FFFFFF"/>
+                <w:sz w:val="19"/>
+                <w:szCs w:val="19"/>
+              </w:rPr>
+              <w:t xml:space="preserve">Isi</w:t>
+            </w:r>
+          </w:p>
+        </w:tc>
+      </w:tr>
+      <w:tr>
+        <w:trPr>
+          <w:cantSplit/>
+        </w:trPr>
+        <w:tc>
+          <w:tcPr>
+            <w:tcW w:type="dxa" w:w="2711"/>
+            <w:tcMar>
+              <w:top w:type="dxa" w:w="70"/>
+              <w:left w:type="dxa" w:w="110"/>
+              <w:bottom w:type="dxa" w:w="70"/>
+              <w:right w:type="dxa" w:w="110"/>
+            </w:tcMar>
+          </w:tcPr>
+          <w:p>
+            <w:pPr>
+              <w:spacing w:after="0"/>
+            </w:pPr>
+            <w:r>
+              <w:rPr>
+                <w:b/>
+                <w:bCs/>
+                <w:sz w:val="19"/>
+                <w:szCs w:val="19"/>
+              </w:rPr>
+              <w:t xml:space="preserve">Kesimpulan</w:t>
+            </w:r>
+          </w:p>
+        </w:tc>
+        <w:tc>
+          <w:tcPr>
+            <w:tcW w:type="dxa" w:w="6927"/>
+            <w:tcMar>
+              <w:top w:type="dxa" w:w="70"/>
+              <w:left w:type="dxa" w:w="110"/>
+              <w:bottom w:type="dxa" w:w="70"/>
+              <w:right w:type="dxa" w:w="110"/>
+            </w:tcMar>
+          </w:tcPr>
+          <w:p>
+            <w:pPr>
+              <w:spacing w:after="0"/>
+            </w:pPr>
+            <w:r>
+              <w:rPr>
+                <w:sz w:val="19"/>
+                <w:szCs w:val="19"/>
+              </w:rPr>
+              <w:t xml:space="preserve">Satu kalimat: seberapa rutin anak berlatih, mapel yang kuat dan yang perlu didampingi, serta status jadwal TKA.</w:t>
+            </w:r>
+          </w:p>
+        </w:tc>
+      </w:tr>
+      <w:tr>
+        <w:trPr>
+          <w:cantSplit/>
+        </w:trPr>
+        <w:tc>
+          <w:tcPr>
+            <w:tcW w:type="dxa" w:w="2711"/>
+            <w:shd w:fill="F6F8FB" w:color="auto" w:val="clear"/>
+            <w:tcMar>
+              <w:top w:type="dxa" w:w="70"/>
+              <w:left w:type="dxa" w:w="110"/>
+              <w:bottom w:type="dxa" w:w="70"/>
+              <w:right w:type="dxa" w:w="110"/>
+            </w:tcMar>
+          </w:tcPr>
+          <w:p>
+            <w:pPr>
+              <w:spacing w:after="0"/>
+            </w:pPr>
+            <w:r>
+              <w:rPr>
+                <w:b/>
+                <w:bCs/>
+                <w:sz w:val="19"/>
+                <w:szCs w:val="19"/>
+              </w:rPr>
+              <w:t xml:space="preserve">📊 Gambaran keseluruhan</w:t>
+            </w:r>
+          </w:p>
+        </w:tc>
+        <w:tc>
+          <w:tcPr>
+            <w:tcW w:type="dxa" w:w="6927"/>
+            <w:shd w:fill="F6F8FB" w:color="auto" w:val="clear"/>
+            <w:tcMar>
+              <w:top w:type="dxa" w:w="70"/>
+              <w:left w:type="dxa" w:w="110"/>
+              <w:bottom w:type="dxa" w:w="70"/>
+              <w:right w:type="dxa" w:w="110"/>
+            </w:tcMar>
+          </w:tcPr>
+          <w:p>
+            <w:pPr>
+              <w:spacing w:after="0"/>
+            </w:pPr>
+            <w:r>
+              <w:rPr>
+                <w:sz w:val="19"/>
+                <w:szCs w:val="19"/>
+              </w:rPr>
+              <w:t xml:space="preserve">Sejak mulai: jumlah soal, persen benar, waktu mengerjakan soal, dan per mapel level yang lulus serta misi yang selesai.</w:t>
+            </w:r>
+          </w:p>
+        </w:tc>
+      </w:tr>
+      <w:tr>
+        <w:trPr>
+          <w:cantSplit/>
+        </w:trPr>
+        <w:tc>
+          <w:tcPr>
+            <w:tcW w:type="dxa" w:w="2711"/>
+            <w:tcMar>
+              <w:top w:type="dxa" w:w="70"/>
+              <w:left w:type="dxa" w:w="110"/>
+              <w:bottom w:type="dxa" w:w="70"/>
+              <w:right w:type="dxa" w:w="110"/>
+            </w:tcMar>
+          </w:tcPr>
+          <w:p>
+            <w:pPr>
+              <w:spacing w:after="0"/>
+            </w:pPr>
+            <w:r>
+              <w:rPr>
+                <w:b/>
+                <w:bCs/>
+                <w:sz w:val="19"/>
+                <w:szCs w:val="19"/>
+              </w:rPr>
+              <w:t xml:space="preserve">🗓️ Minggu ini</w:t>
+            </w:r>
+          </w:p>
+        </w:tc>
+        <w:tc>
+          <w:tcPr>
+            <w:tcW w:type="dxa" w:w="6927"/>
+            <w:tcMar>
+              <w:top w:type="dxa" w:w="70"/>
+              <w:left w:type="dxa" w:w="110"/>
+              <w:bottom w:type="dxa" w:w="70"/>
+              <w:right w:type="dxa" w:w="110"/>
+            </w:tcMar>
+          </w:tcPr>
+          <w:p>
+            <w:pPr>
+              <w:spacing w:after="0"/>
+            </w:pPr>
+            <w:r>
+              <w:rPr>
+                <w:sz w:val="19"/>
+                <w:szCs w:val="19"/>
+              </w:rPr>
+              <w:t xml:space="preserve">7 hari terakhir: hari belajar, hari berturut-turut, target harian tercapai, soal dan level lulus, waktu mengerjakan soal level per hari.</w:t>
+            </w:r>
+          </w:p>
+        </w:tc>
+      </w:tr>
+      <w:tr>
+        <w:trPr>
+          <w:cantSplit/>
+        </w:trPr>
+        <w:tc>
+          <w:tcPr>
+            <w:tcW w:type="dxa" w:w="2711"/>
+            <w:shd w:fill="F6F8FB" w:color="auto" w:val="clear"/>
+            <w:tcMar>
+              <w:top w:type="dxa" w:w="70"/>
+              <w:left w:type="dxa" w:w="110"/>
+              <w:bottom w:type="dxa" w:w="70"/>
+              <w:right w:type="dxa" w:w="110"/>
+            </w:tcMar>
+          </w:tcPr>
+          <w:p>
+            <w:pPr>
+              <w:spacing w:after="0"/>
+            </w:pPr>
+            <w:r>
+              <w:rPr>
+                <w:b/>
+                <w:bCs/>
+                <w:sz w:val="19"/>
+                <w:szCs w:val="19"/>
+              </w:rPr>
+              <w:t xml:space="preserve">🎯 Menuju TKA</w:t>
+            </w:r>
+          </w:p>
+        </w:tc>
+        <w:tc>
+          <w:tcPr>
+            <w:tcW w:type="dxa" w:w="6927"/>
+            <w:shd w:fill="F6F8FB" w:color="auto" w:val="clear"/>
+            <w:tcMar>
+              <w:top w:type="dxa" w:w="70"/>
+              <w:left w:type="dxa" w:w="110"/>
+              <w:bottom w:type="dxa" w:w="70"/>
+              <w:right w:type="dxa" w:w="110"/>
+            </w:tcMar>
+          </w:tcPr>
+          <w:p>
+            <w:pPr>
+              <w:spacing w:after="0"/>
+            </w:pPr>
+            <w:r>
+              <w:rPr>
+                <w:sz w:val="19"/>
+                <w:szCs w:val="19"/>
+              </w:rPr>
+              <w:t xml:space="preserve">H-…, level Matematika &amp; Bahasa Indonesia yang lulus, status jadwal, dan Simulasi TKA.</w:t>
+            </w:r>
+          </w:p>
+        </w:tc>
+      </w:tr>
+      <w:tr>
+        <w:trPr>
+          <w:cantSplit/>
+        </w:trPr>
+        <w:tc>
+          <w:tcPr>
+            <w:tcW w:type="dxa" w:w="2711"/>
+            <w:tcMar>
+              <w:top w:type="dxa" w:w="70"/>
+              <w:left w:type="dxa" w:w="110"/>
+              <w:bottom w:type="dxa" w:w="70"/>
+              <w:right w:type="dxa" w:w="110"/>
+            </w:tcMar>
+          </w:tcPr>
+          <w:p>
+            <w:pPr>
+              <w:spacing w:after="0"/>
+            </w:pPr>
+            <w:r>
+              <w:rPr>
+                <w:b/>
+                <w:bCs/>
+                <w:sz w:val="19"/>
+                <w:szCs w:val="19"/>
+              </w:rPr>
+              <w:t xml:space="preserve">👏 Sudah dikuasai</w:t>
+            </w:r>
+          </w:p>
+        </w:tc>
+        <w:tc>
+          <w:tcPr>
+            <w:tcW w:type="dxa" w:w="6927"/>
+            <w:tcMar>
+              <w:top w:type="dxa" w:w="70"/>
+              <w:left w:type="dxa" w:w="110"/>
+              <w:bottom w:type="dxa" w:w="70"/>
+              <w:right w:type="dxa" w:w="110"/>
+            </w:tcMar>
+          </w:tcPr>
+          <w:p>
+            <w:pPr>
+              <w:spacing w:after="0"/>
+            </w:pPr>
+            <w:r>
+              <w:rPr>
+                <w:sz w:val="19"/>
+                <w:szCs w:val="19"/>
+              </w:rPr>
+              <w:t xml:space="preserve">Misi yang selesai minggu ini dan misi dengan 85% benar ke atas.</w:t>
+            </w:r>
+          </w:p>
+        </w:tc>
+      </w:tr>
+      <w:tr>
+        <w:trPr>
+          <w:cantSplit/>
+        </w:trPr>
+        <w:tc>
+          <w:tcPr>
+            <w:tcW w:type="dxa" w:w="2711"/>
+            <w:shd w:fill="F6F8FB" w:color="auto" w:val="clear"/>
+            <w:tcMar>
+              <w:top w:type="dxa" w:w="70"/>
+              <w:left w:type="dxa" w:w="110"/>
+              <w:bottom w:type="dxa" w:w="70"/>
+              <w:right w:type="dxa" w:w="110"/>
+            </w:tcMar>
+          </w:tcPr>
+          <w:p>
+            <w:pPr>
+              <w:spacing w:after="0"/>
+            </w:pPr>
+            <w:r>
+              <w:rPr>
+                <w:b/>
+                <w:bCs/>
+                <w:sz w:val="19"/>
+                <w:szCs w:val="19"/>
+              </w:rPr>
+              <w:t xml:space="preserve">🧩 Perlu bantuan</w:t>
+            </w:r>
+          </w:p>
+        </w:tc>
+        <w:tc>
+          <w:tcPr>
+            <w:tcW w:type="dxa" w:w="6927"/>
+            <w:shd w:fill="F6F8FB" w:color="auto" w:val="clear"/>
+            <w:tcMar>
+              <w:top w:type="dxa" w:w="70"/>
+              <w:left w:type="dxa" w:w="110"/>
+              <w:bottom w:type="dxa" w:w="70"/>
+              <w:right w:type="dxa" w:w="110"/>
+            </w:tcMar>
+          </w:tcPr>
+          <w:p>
+            <w:pPr>
+              <w:spacing w:after="0"/>
+            </w:pPr>
+            <w:r>
+              <w:rPr>
+                <w:sz w:val="19"/>
+                <w:szCs w:val="19"/>
+              </w:rPr>
+              <w:t xml:space="preserve">Level yang masih tertahan, misi di bawah 65% benar, selisih antar-mapel, tanda menebak, dan kesulitan yang sudah teratasi.</w:t>
+            </w:r>
+          </w:p>
+        </w:tc>
+      </w:tr>
+      <w:tr>
+        <w:trPr>
+          <w:cantSplit/>
+        </w:trPr>
+        <w:tc>
+          <w:tcPr>
+            <w:tcW w:type="dxa" w:w="2711"/>
+            <w:tcMar>
+              <w:top w:type="dxa" w:w="70"/>
+              <w:left w:type="dxa" w:w="110"/>
+              <w:bottom w:type="dxa" w:w="70"/>
+              <w:right w:type="dxa" w:w="110"/>
+            </w:tcMar>
+          </w:tcPr>
+          <w:p>
+            <w:pPr>
+              <w:spacing w:after="0"/>
+            </w:pPr>
+            <w:r>
+              <w:rPr>
+                <w:b/>
+                <w:bCs/>
+                <w:sz w:val="19"/>
+                <w:szCs w:val="19"/>
+              </w:rPr>
+              <w:t xml:space="preserve">💡 Saran minggu ini</w:t>
+            </w:r>
+          </w:p>
+        </w:tc>
+        <w:tc>
+          <w:tcPr>
+            <w:tcW w:type="dxa" w:w="6927"/>
+            <w:tcMar>
+              <w:top w:type="dxa" w:w="70"/>
+              <w:left w:type="dxa" w:w="110"/>
+              <w:bottom w:type="dxa" w:w="70"/>
+              <w:right w:type="dxa" w:w="110"/>
+            </w:tcMar>
+          </w:tcPr>
+          <w:p>
+            <w:pPr>
+              <w:spacing w:after="0"/>
+            </w:pPr>
+            <w:r>
+              <w:rPr>
+                <w:sz w:val="19"/>
+                <w:szCs w:val="19"/>
+              </w:rPr>
+              <w:t xml:space="preserve">Paling banyak 4 saran ditambah ajakan memuji anak di grup.</w:t>
+            </w:r>
+          </w:p>
+        </w:tc>
+      </w:tr>
+    </w:tbl>
+    <w:p>
+      <w:pPr>
+        <w:spacing w:after="120"/>
+      </w:pPr>
+    </w:p>
+    <w:p>
+      <w:pPr>
+        <w:spacing w:after="120"/>
+      </w:pPr>
+      <w:r>
+        <w:t xml:space="preserve">Ketuk </w:t>
+      </w:r>
+      <w:r>
+        <w:rPr>
+          <w:b/>
+          <w:bCs/>
+        </w:rPr>
+        <w:t xml:space="preserve">Lihat &amp; ubah isi pesan</w:t>
+      </w:r>
+      <w:r>
+        <w:t xml:space="preserve"> untuk membaca atau mengubah teksnya (mis. mengganti nama panggilan anak). </w:t>
+      </w:r>
+      <w:r>
+        <w:rPr>
+          <w:b/>
+          <w:bCs/>
+        </w:rPr>
+        <w:t xml:space="preserve">💬 Kirim via WhatsApp</w:t>
+      </w:r>
+      <w:r>
+        <w:t xml:space="preserve"> membuka WhatsApp; pilih grup keluarga lalu kirim. </w:t>
+      </w:r>
+      <w:r>
+        <w:rPr>
+          <w:b/>
+          <w:bCs/>
+        </w:rPr>
+        <w:t xml:space="preserve">📤 Bagikan…</w:t>
+      </w:r>
+      <w:r>
+        <w:t xml:space="preserve"> memakai menu bagikan HP, </w:t>
+      </w:r>
+      <w:r>
+        <w:rPr>
+          <w:b/>
+          <w:bCs/>
+        </w:rPr>
+        <w:t xml:space="preserve">📋 Salin teks</w:t>
+      </w:r>
+      <w:r>
+        <w:t xml:space="preserve"> menyalin teks untuk ditempel di mana saja. Tombol </w:t>
+      </w:r>
+      <w:r>
+        <w:rPr>
+          <w:b/>
+          <w:bCs/>
+        </w:rPr>
+        <w:t xml:space="preserve">↺ Susun ulang</w:t>
+      </w:r>
+      <w:r>
+        <w:t xml:space="preserve"> mengembalikan teks dari data terbaru.</w:t>
+      </w:r>
+    </w:p>
+    <w:tbl>
+      <w:tblPr>
+        <w:tblW w:type="dxa" w:w="9638"/>
+        <w:tblBorders>
+          <w:top w:val="none" w:color="FFFFFF" w:sz="0"/>
+          <w:left w:val="single" w:color="C98A12" w:sz="30"/>
+          <w:bottom w:val="none" w:color="FFFFFF" w:sz="0"/>
+          <w:right w:val="none" w:color="FFFFFF" w:sz="0"/>
+          <w:insideH w:val="none" w:color="FFFFFF" w:sz="0"/>
+          <w:insideV w:val="none" w:color="FFFFFF" w:sz="0"/>
+        </w:tblBorders>
+      </w:tblPr>
+      <w:tblGrid>
+        <w:gridCol w:w="9638"/>
+      </w:tblGrid>
+      <w:tr>
+        <w:trPr>
+          <w:cantSplit/>
+        </w:trPr>
+        <w:tc>
+          <w:tcPr>
+            <w:tcW w:type="dxa" w:w="9638"/>
+            <w:shd w:fill="FDF4E1" w:color="auto" w:val="clear"/>
+            <w:tcMar>
+              <w:top w:type="dxa" w:w="120"/>
+              <w:left w:type="dxa" w:w="200"/>
+              <w:bottom w:type="dxa" w:w="120"/>
+              <w:right w:type="dxa" w:w="160"/>
+            </w:tcMar>
+          </w:tcPr>
+          <w:p>
+            <w:pPr>
+              <w:spacing w:after="40"/>
+            </w:pPr>
+            <w:r>
+              <w:rPr>
+                <w:b/>
+                <w:bCs/>
+                <w:color w:val="C98A12"/>
+                <w:sz w:val="20"/>
+                <w:szCs w:val="20"/>
+              </w:rPr>
+              <w:t xml:space="preserve">Kode Anak tidak ikut dikirim</w:t>
+            </w:r>
+          </w:p>
+          <w:p>
+            <w:pPr>
+              <w:spacing w:after="40"/>
+            </w:pPr>
+            <w:r>
+              <w:rPr>
+                <w:sz w:val="19"/>
+                <w:szCs w:val="19"/>
+              </w:rPr>
+              <w:t xml:space="preserve">Pesan ini sengaja tidak memuat Kode Anak. Siapa pun yang memegang kode itu bisa mengubah kemajuan anak. Bila anggota keluarga lain ingin memantau sendiri, masukkan kodenya langsung di HP mereka (</w:t>
+            </w:r>
+            <w:r>
+              <w:rPr>
+                <w:b/>
+                <w:bCs/>
+                <w:sz w:val="19"/>
+                <w:szCs w:val="19"/>
+              </w:rPr>
+              <w:t xml:space="preserve">Pengaturan → Sudah punya Kode Anak?</w:t>
+            </w:r>
+            <w:r>
+              <w:rPr>
+                <w:sz w:val="19"/>
+                <w:szCs w:val="19"/>
+              </w:rPr>
+              <w:t xml:space="preserve">).</w:t>
+            </w:r>
+          </w:p>
+        </w:tc>
+      </w:tr>
+    </w:tbl>
+    <w:p>
+      <w:pPr>
+        <w:spacing w:after="120"/>
+      </w:pPr>
+    </w:p>
+    <w:p>
+      <w:pPr>
+        <w:pStyle w:val="Heading2"/>
+      </w:pPr>
+      <w:r>
+        <w:t xml:space="preserve">5.3 Di mana anak kesulitan</w:t>
       </w:r>
     </w:p>
     <w:p>
@@ -10939,7 +11590,7 @@
         <w:pStyle w:val="Heading2"/>
       </w:pPr>
       <w:r>
-        <w:t xml:space="preserve">5.3 Target vs kemajuan nyata</w:t>
+        <w:t xml:space="preserve">5.4 Target vs kemajuan nyata</w:t>
       </w:r>
     </w:p>
     <w:p>
@@ -11696,7 +12347,7 @@
         <w:pStyle w:val="Heading3"/>
       </w:pPr>
       <w:r>
-        <w:t xml:space="preserve">5.3.1 Catatan 14 hari terakhir</w:t>
+        <w:t xml:space="preserve">5.4.1 Catatan 14 hari terakhir</w:t>
       </w:r>
     </w:p>
     <w:p>
@@ -12507,7 +13158,7 @@
         <w:pStyle w:val="Heading2"/>
       </w:pPr>
       <w:r>
-        <w:t xml:space="preserve">5.4 Pos Tes</w:t>
+        <w:t xml:space="preserve">5.5 Pos Tes</w:t>
       </w:r>
     </w:p>
     <w:tbl>
@@ -12813,7 +13464,7 @@
         <w:pStyle w:val="Heading2"/>
       </w:pPr>
       <w:r>
-        <w:t xml:space="preserve">5.5 Simulasi TKA</w:t>
+        <w:t xml:space="preserve">5.6 Simulasi TKA</w:t>
       </w:r>
     </w:p>
     <w:p>
@@ -12839,7 +13490,7 @@
         <w:pStyle w:val="Heading2"/>
       </w:pPr>
       <w:r>
-        <w:t xml:space="preserve">5.6 Aktivitas terakhir</w:t>
+        <w:t xml:space="preserve">5.7 Aktivitas terakhir</w:t>
       </w:r>
     </w:p>
     <w:p>
@@ -12875,7 +13526,7 @@
         <w:pStyle w:val="Heading2"/>
       </w:pPr>
       <w:r>
-        <w:t xml:space="preserve">5.7 Kemajuan per misi</w:t>
+        <w:t xml:space="preserve">5.8 Kemajuan per misi</w:t>
       </w:r>
     </w:p>
     <w:p>

</xml_diff>

<commit_message>
Tabungan belajar: tandai tanggal libur 🌴 atau hari cepat 🚀 (+1 level TKA & B. Inggris)
Bawaan semua hari normal. Mode 🌴 menjadikan tanggal libur; mode 🚀 mengembalikan
hari libur ke normal atau menjadikan hari normal sebagai hari cepat. Mode percepat
lama (target harian dikunci) dihapus. Hari cepat ikut tersinkron dan tampil di
kalender, minggu ini, rincian tanggal, dan Dasbor Ortu. Panduan diperbarui.

Co-Authored-By: Claude Opus 5.5 <noreply@anthropic.com>
</commit_message>
<xml_diff>
--- a/Panduan_Petualangan_TKA_SD.docx
+++ b/Panduan_Petualangan_TKA_SD.docx
@@ -8797,7 +8797,17 @@
         <w:t xml:space="preserve">tabungan</w:t>
       </w:r>
       <w:r>
-        <w:t xml:space="preserve"> dan anak boleh memilih cara memakainya:</w:t>
+        <w:t xml:space="preserve">. Bawaannya semua hari </w:t>
+      </w:r>
+      <w:r>
+        <w:rPr>
+          <w:b/>
+          <w:bCs/>
+        </w:rPr>
+        <w:t xml:space="preserve">normal</w:t>
+      </w:r>
+      <w:r>
+        <w:t xml:space="preserve"> sesuai rencana. Anak memilih salah satu tombol, lalu mengetuk tanggal dalam 14 hari ke depan:</w:t>
       </w:r>
     </w:p>
     <w:p>
@@ -8817,7 +8827,7 @@
         <w:t xml:space="preserve">🌴 Ringankan &amp; boleh libur</w:t>
       </w:r>
       <w:r>
-        <w:t xml:space="preserve"> (bawaan): target harian berikutnya ikut ringan, dan anak bisa memilih </w:t>
+        <w:t xml:space="preserve">: tanggal yang diketuk menjadi </w:t>
       </w:r>
       <w:r>
         <w:rPr>
@@ -8827,7 +8837,7 @@
         <w:t xml:space="preserve">hari libur</w:t>
       </w:r>
       <w:r>
-        <w:t xml:space="preserve"> dalam 14 hari ke depan (ketuk tanggalnya; ketuk lagi untuk membatalkan). Aplikasi memberi tahu tabungannya cukup untuk berapa hari libur; bila libur lebih banyak dari tabungan, target hari lain sedikit naik.</w:t>
+        <w:t xml:space="preserve"> (🌴). Ketuk lagi untuk membatalkan. Aplikasi memberi tahu tabungannya cukup untuk berapa hari libur; bila libur lebih banyak dari tabungan, target hari lain sedikit naik.</w:t>
       </w:r>
     </w:p>
     <w:p>
@@ -8847,7 +8857,37 @@
         <w:t xml:space="preserve">🚀 Percepat selesai</w:t>
       </w:r>
       <w:r>
-        <w:t xml:space="preserve">: target harian tetap seperti awal, sehingga materi selesai lebih cepat dan waktu mengulang lebih banyak.</w:t>
+        <w:t xml:space="preserve">: hari libur pilihan yang diketuk kembali </w:t>
+      </w:r>
+      <w:r>
+        <w:rPr>
+          <w:b/>
+          <w:bCs/>
+        </w:rPr>
+        <w:t xml:space="preserve">normal</w:t>
+      </w:r>
+      <w:r>
+        <w:t xml:space="preserve">. Hari normal yang diketuk menjadi </w:t>
+      </w:r>
+      <w:r>
+        <w:rPr>
+          <w:b/>
+          <w:bCs/>
+        </w:rPr>
+        <w:t xml:space="preserve">hari cepat</w:t>
+      </w:r>
+      <w:r>
+        <w:t xml:space="preserve"> (🚀) dengan tambahan </w:t>
+      </w:r>
+      <w:r>
+        <w:rPr>
+          <w:b/>
+          <w:bCs/>
+        </w:rPr>
+        <w:t xml:space="preserve">1 level TKA dan 1 level Bahasa Inggris</w:t>
+      </w:r>
+      <w:r>
+        <w:t xml:space="preserve">, sehingga materi selesai lebih cepat. Ketuk lagi untuk mengembalikannya ke normal.</w:t>
       </w:r>
     </w:p>
     <w:p>
@@ -9217,7 +9257,7 @@
                 <w:sz w:val="19"/>
                 <w:szCs w:val="19"/>
               </w:rPr>
-              <w:t xml:space="preserve">😌</w:t>
+              <w:t xml:space="preserve">🚀</w:t>
             </w:r>
           </w:p>
         </w:tc>
@@ -9241,58 +9281,58 @@
                 <w:sz w:val="19"/>
                 <w:szCs w:val="19"/>
               </w:rPr>
+              <w:t xml:space="preserve">Hari cepat pilihan anak: +1 level TKA dan +1 level Bahasa Inggris.</w:t>
+            </w:r>
+          </w:p>
+        </w:tc>
+      </w:tr>
+      <w:tr>
+        <w:trPr>
+          <w:cantSplit/>
+        </w:trPr>
+        <w:tc>
+          <w:tcPr>
+            <w:tcW w:type="dxa" w:w="2410"/>
+            <w:tcMar>
+              <w:top w:type="dxa" w:w="70"/>
+              <w:left w:type="dxa" w:w="110"/>
+              <w:bottom w:type="dxa" w:w="70"/>
+              <w:right w:type="dxa" w:w="110"/>
+            </w:tcMar>
+          </w:tcPr>
+          <w:p>
+            <w:pPr>
+              <w:spacing w:after="0"/>
+            </w:pPr>
+            <w:r>
+              <w:rPr>
+                <w:sz w:val="19"/>
+                <w:szCs w:val="19"/>
+              </w:rPr>
+              <w:t xml:space="preserve">😌</w:t>
+            </w:r>
+          </w:p>
+        </w:tc>
+        <w:tc>
+          <w:tcPr>
+            <w:tcW w:type="dxa" w:w="7228"/>
+            <w:tcMar>
+              <w:top w:type="dxa" w:w="70"/>
+              <w:left w:type="dxa" w:w="110"/>
+              <w:bottom w:type="dxa" w:w="70"/>
+              <w:right w:type="dxa" w:w="110"/>
+            </w:tcMar>
+          </w:tcPr>
+          <w:p>
+            <w:pPr>
+              <w:spacing w:after="0"/>
+            </w:pPr>
+            <w:r>
+              <w:rPr>
+                <w:sz w:val="19"/>
+                <w:szCs w:val="19"/>
+              </w:rPr>
               <w:t xml:space="preserve">Rehat H-1 sebelum TKA.</w:t>
-            </w:r>
-          </w:p>
-        </w:tc>
-      </w:tr>
-      <w:tr>
-        <w:trPr>
-          <w:cantSplit/>
-        </w:trPr>
-        <w:tc>
-          <w:tcPr>
-            <w:tcW w:type="dxa" w:w="2410"/>
-            <w:tcMar>
-              <w:top w:type="dxa" w:w="70"/>
-              <w:left w:type="dxa" w:w="110"/>
-              <w:bottom w:type="dxa" w:w="70"/>
-              <w:right w:type="dxa" w:w="110"/>
-            </w:tcMar>
-          </w:tcPr>
-          <w:p>
-            <w:pPr>
-              <w:spacing w:after="0"/>
-            </w:pPr>
-            <w:r>
-              <w:rPr>
-                <w:sz w:val="19"/>
-                <w:szCs w:val="19"/>
-              </w:rPr>
-              <w:t xml:space="preserve">🏁</w:t>
-            </w:r>
-          </w:p>
-        </w:tc>
-        <w:tc>
-          <w:tcPr>
-            <w:tcW w:type="dxa" w:w="7228"/>
-            <w:tcMar>
-              <w:top w:type="dxa" w:w="70"/>
-              <w:left w:type="dxa" w:w="110"/>
-              <w:bottom w:type="dxa" w:w="70"/>
-              <w:right w:type="dxa" w:w="110"/>
-            </w:tcMar>
-          </w:tcPr>
-          <w:p>
-            <w:pPr>
-              <w:spacing w:after="0"/>
-            </w:pPr>
-            <w:r>
-              <w:rPr>
-                <w:sz w:val="19"/>
-                <w:szCs w:val="19"/>
-              </w:rPr>
-              <w:t xml:space="preserve">Hari TKA.</w:t>
             </w:r>
           </w:p>
         </w:tc>
@@ -9321,7 +9361,7 @@
                 <w:sz w:val="19"/>
                 <w:szCs w:val="19"/>
               </w:rPr>
-              <w:t xml:space="preserve">🎉</w:t>
+              <w:t xml:space="preserve">🏁</w:t>
             </w:r>
           </w:p>
         </w:tc>
@@ -9345,58 +9385,58 @@
                 <w:sz w:val="19"/>
                 <w:szCs w:val="19"/>
               </w:rPr>
+              <w:t xml:space="preserve">Hari TKA.</w:t>
+            </w:r>
+          </w:p>
+        </w:tc>
+      </w:tr>
+      <w:tr>
+        <w:trPr>
+          <w:cantSplit/>
+        </w:trPr>
+        <w:tc>
+          <w:tcPr>
+            <w:tcW w:type="dxa" w:w="2410"/>
+            <w:tcMar>
+              <w:top w:type="dxa" w:w="70"/>
+              <w:left w:type="dxa" w:w="110"/>
+              <w:bottom w:type="dxa" w:w="70"/>
+              <w:right w:type="dxa" w:w="110"/>
+            </w:tcMar>
+          </w:tcPr>
+          <w:p>
+            <w:pPr>
+              <w:spacing w:after="0"/>
+            </w:pPr>
+            <w:r>
+              <w:rPr>
+                <w:sz w:val="19"/>
+                <w:szCs w:val="19"/>
+              </w:rPr>
+              <w:t xml:space="preserve">🎉</w:t>
+            </w:r>
+          </w:p>
+        </w:tc>
+        <w:tc>
+          <w:tcPr>
+            <w:tcW w:type="dxa" w:w="7228"/>
+            <w:tcMar>
+              <w:top w:type="dxa" w:w="70"/>
+              <w:left w:type="dxa" w:w="110"/>
+              <w:bottom w:type="dxa" w:w="70"/>
+              <w:right w:type="dxa" w:w="110"/>
+            </w:tcMar>
+          </w:tcPr>
+          <w:p>
+            <w:pPr>
+              <w:spacing w:after="0"/>
+            </w:pPr>
+            <w:r>
+              <w:rPr>
+                <w:sz w:val="19"/>
+                <w:szCs w:val="19"/>
+              </w:rPr>
               <w:t xml:space="preserve">Tidak ada target (sudah tercapai lebih awal).</w:t>
-            </w:r>
-          </w:p>
-        </w:tc>
-      </w:tr>
-      <w:tr>
-        <w:trPr>
-          <w:cantSplit/>
-        </w:trPr>
-        <w:tc>
-          <w:tcPr>
-            <w:tcW w:type="dxa" w:w="2410"/>
-            <w:tcMar>
-              <w:top w:type="dxa" w:w="70"/>
-              <w:left w:type="dxa" w:w="110"/>
-              <w:bottom w:type="dxa" w:w="70"/>
-              <w:right w:type="dxa" w:w="110"/>
-            </w:tcMar>
-          </w:tcPr>
-          <w:p>
-            <w:pPr>
-              <w:spacing w:after="0"/>
-            </w:pPr>
-            <w:r>
-              <w:rPr>
-                <w:sz w:val="19"/>
-                <w:szCs w:val="19"/>
-              </w:rPr>
-              <w:t xml:space="preserve">✅ (hari lalu)</w:t>
-            </w:r>
-          </w:p>
-        </w:tc>
-        <w:tc>
-          <w:tcPr>
-            <w:tcW w:type="dxa" w:w="7228"/>
-            <w:tcMar>
-              <w:top w:type="dxa" w:w="70"/>
-              <w:left w:type="dxa" w:w="110"/>
-              <w:bottom w:type="dxa" w:w="70"/>
-              <w:right w:type="dxa" w:w="110"/>
-            </w:tcMar>
-          </w:tcPr>
-          <w:p>
-            <w:pPr>
-              <w:spacing w:after="0"/>
-            </w:pPr>
-            <w:r>
-              <w:rPr>
-                <w:sz w:val="19"/>
-                <w:szCs w:val="19"/>
-              </w:rPr>
-              <w:t xml:space="preserve">Ada level lulus atau tes dikerjakan.</w:t>
             </w:r>
           </w:p>
         </w:tc>
@@ -9425,7 +9465,7 @@
                 <w:sz w:val="19"/>
                 <w:szCs w:val="19"/>
               </w:rPr>
-              <w:t xml:space="preserve">✖ terlewat (hari lalu)</w:t>
+              <w:t xml:space="preserve">✅ (hari lalu)</w:t>
             </w:r>
           </w:p>
         </w:tc>
@@ -9433,6 +9473,57 @@
           <w:tcPr>
             <w:tcW w:type="dxa" w:w="7228"/>
             <w:shd w:fill="F6F8FB" w:color="auto" w:val="clear"/>
+            <w:tcMar>
+              <w:top w:type="dxa" w:w="70"/>
+              <w:left w:type="dxa" w:w="110"/>
+              <w:bottom w:type="dxa" w:w="70"/>
+              <w:right w:type="dxa" w:w="110"/>
+            </w:tcMar>
+          </w:tcPr>
+          <w:p>
+            <w:pPr>
+              <w:spacing w:after="0"/>
+            </w:pPr>
+            <w:r>
+              <w:rPr>
+                <w:sz w:val="19"/>
+                <w:szCs w:val="19"/>
+              </w:rPr>
+              <w:t xml:space="preserve">Ada level lulus atau tes dikerjakan.</w:t>
+            </w:r>
+          </w:p>
+        </w:tc>
+      </w:tr>
+      <w:tr>
+        <w:trPr>
+          <w:cantSplit/>
+        </w:trPr>
+        <w:tc>
+          <w:tcPr>
+            <w:tcW w:type="dxa" w:w="2410"/>
+            <w:tcMar>
+              <w:top w:type="dxa" w:w="70"/>
+              <w:left w:type="dxa" w:w="110"/>
+              <w:bottom w:type="dxa" w:w="70"/>
+              <w:right w:type="dxa" w:w="110"/>
+            </w:tcMar>
+          </w:tcPr>
+          <w:p>
+            <w:pPr>
+              <w:spacing w:after="0"/>
+            </w:pPr>
+            <w:r>
+              <w:rPr>
+                <w:sz w:val="19"/>
+                <w:szCs w:val="19"/>
+              </w:rPr>
+              <w:t xml:space="preserve">✖ terlewat (hari lalu)</w:t>
+            </w:r>
+          </w:p>
+        </w:tc>
+        <w:tc>
+          <w:tcPr>
+            <w:tcW w:type="dxa" w:w="7228"/>
             <w:tcMar>
               <w:top w:type="dxa" w:w="70"/>
               <w:left w:type="dxa" w:w="110"/>
@@ -12331,7 +12422,7 @@
                 <w:sz w:val="19"/>
                 <w:szCs w:val="19"/>
               </w:rPr>
-              <w:t xml:space="preserve">Target level per hari belajar, perkiraan materi selesai, simulasi tuntas (dari 20), dan mode 🚀 percepat bila dipilih anak.</w:t>
+              <w:t xml:space="preserve">Target level per hari belajar, perkiraan materi selesai, simulasi tuntas (dari 20), dan jumlah hari cepat 🚀 yang dipilih anak.</w:t>
             </w:r>
           </w:p>
         </w:tc>

</xml_diff>

<commit_message>
Dasbor Ortu: latihan Dengar & Baca Bahasa Inggris tampil di Aktivitas terakhir
Sub level, Baca & Koreksi, dan "seluruh teks didengarkan" kini dicatat dengan
waktunya (S.logIng, 200 terakhir, tersinkron) dan digabung dengan riwayat level.
Panduan diperbarui.

Co-Authored-By: Claude Opus 5.5 <noreply@anthropic.com>
</commit_message>
<xml_diff>
--- a/Panduan_Petualangan_TKA_SD.docx
+++ b/Panduan_Petualangan_TKA_SD.docx
@@ -13589,7 +13589,7 @@
         <w:spacing w:after="120"/>
       </w:pPr>
       <w:r>
-        <w:t xml:space="preserve">Delapan level terakhir yang dimainkan sampai selesai: waktu, misi, level, lalu hasilnya, mis. </w:t>
+        <w:t xml:space="preserve">Delapan kegiatan terakhir yang dimainkan sampai selesai: waktu, misi, level, lalu hasilnya, mis. </w:t>
       </w:r>
       <w:r>
         <w:rPr>
@@ -13609,7 +13609,37 @@
         <w:t xml:space="preserve">"belum lulus"</w:t>
       </w:r>
       <w:r>
-        <w:t xml:space="preserve">. Jumlah salah mencakup semua putaran, termasuk yang diulang dari nomor 1. Tantangan Harian dan tes tidak tampil di sini.</w:t>
+        <w:t xml:space="preserve">. Jumlah salah mencakup semua putaran, termasuk yang diulang dari nomor 1. Latihan Dengar &amp; Baca Bahasa Inggris juga tampil: </w:t>
+      </w:r>
+      <w:r>
+        <w:rPr>
+          <w:b/>
+          <w:bCs/>
+        </w:rPr>
+        <w:t xml:space="preserve">🎧 Sub level N</w:t>
+      </w:r>
+      <w:r>
+        <w:t xml:space="preserve"> (nilai dan tuntas atau belum), </w:t>
+      </w:r>
+      <w:r>
+        <w:rPr>
+          <w:b/>
+          <w:bCs/>
+        </w:rPr>
+        <w:t xml:space="preserve">🎤 Baca &amp; Koreksi</w:t>
+      </w:r>
+      <w:r>
+        <w:t xml:space="preserve"> (persen kata terbaca tepat), dan </w:t>
+      </w:r>
+      <w:r>
+        <w:rPr>
+          <w:b/>
+          <w:bCs/>
+        </w:rPr>
+        <w:t xml:space="preserve">🎧 Dengarkan teks</w:t>
+      </w:r>
+      <w:r>
+        <w:t xml:space="preserve"> (seluruh teks sudah didengarkan). Tantangan Harian dan tes tidak tampil di sini.</w:t>
       </w:r>
     </w:p>
     <w:p>

</xml_diff>